<commit_message>
updated step 1.2 docx
</commit_message>
<xml_diff>
--- a/1_Stock_Picker/README texts/Layer-1_Step1.2.docx
+++ b/1_Stock_Picker/README texts/Layer-1_Step1.2.docx
@@ -843,6 +843,54 @@
       </w:r>
     </w:p>
     <w:p>
+      <w:proofErr w:type="spellStart"/>
+      <w:r>
+        <w:t>run</w:t>
+      </w:r>
+      <w:r>
+        <w:t>from</w:t>
+      </w:r>
+      <w:proofErr w:type="spellEnd"/>
+      <w:r>
+        <w:t xml:space="preserve"> 1_Stock_Picker/ with the </w:t>
+      </w:r>
+      <w:proofErr w:type="spellStart"/>
+      <w:r>
+        <w:t>venv</w:t>
+      </w:r>
+      <w:proofErr w:type="spellEnd"/>
+      <w:r>
+        <w:t xml:space="preserve"> activated and PYTHONPATH=</w:t>
+      </w:r>
+      <w:proofErr w:type="spellStart"/>
+      <w:r>
+        <w:t>src</w:t>
+      </w:r>
+      <w:proofErr w:type="spellEnd"/>
+      <w:r>
+        <w:t>:</w:t>
+      </w:r>
+    </w:p>
+    <w:p>
+      <w:r>
+        <w:t>python scripts/top_twos.py</w:t>
+      </w:r>
+    </w:p>
+    <w:p>
+      <w:r>
+        <w:t>python scripts/top_twos.py 50</w:t>
+      </w:r>
+    </w:p>
+    <w:p/>
+    <w:p/>
+    <w:p/>
+    <w:p/>
+    <w:p>
+      <w:r>
+        <w:t>To see which institutions hold a specific ticker and what changed:</w:t>
+      </w:r>
+    </w:p>
+    <w:p>
       <w:r>
         <w:t>bash</w:t>
       </w:r>
@@ -859,7 +907,6 @@
     </w:p>
     <w:p>
       <w:r>
-        <w:lastRenderedPageBreak/>
         <w:t>conn = sqlite3.connect('data/</w:t>
       </w:r>
       <w:proofErr w:type="spellStart"/>
@@ -884,307 +931,12 @@
     <w:p/>
     <w:p>
       <w:r>
-        <w:t>print('=== Top 30 tickers by TWOS score ===')</w:t>
-      </w:r>
-    </w:p>
-    <w:p>
-      <w:r>
-        <w:t xml:space="preserve">rows = </w:t>
-      </w:r>
-      <w:proofErr w:type="spellStart"/>
-      <w:r>
-        <w:t>conn.execute</w:t>
-      </w:r>
-      <w:proofErr w:type="spellEnd"/>
-      <w:r>
-        <w:t>('''</w:t>
-      </w:r>
-    </w:p>
-    <w:p>
-      <w:r>
-        <w:t xml:space="preserve">    SELECT ticker, </w:t>
-      </w:r>
-      <w:proofErr w:type="spellStart"/>
-      <w:r>
-        <w:t>twos_score</w:t>
-      </w:r>
-      <w:proofErr w:type="spellEnd"/>
-      <w:r>
-        <w:t xml:space="preserve">, </w:t>
-      </w:r>
-      <w:proofErr w:type="spellStart"/>
-      <w:r>
-        <w:t>processing_tier</w:t>
-      </w:r>
-      <w:proofErr w:type="spellEnd"/>
-      <w:r>
-        <w:t>,</w:t>
-      </w:r>
-    </w:p>
-    <w:p>
-      <w:r>
-        <w:t xml:space="preserve">           </w:t>
-      </w:r>
-      <w:proofErr w:type="spellStart"/>
-      <w:r>
-        <w:t>institution_count</w:t>
-      </w:r>
-      <w:proofErr w:type="spellEnd"/>
-      <w:r>
-        <w:t xml:space="preserve">, </w:t>
-      </w:r>
-      <w:proofErr w:type="spellStart"/>
-      <w:r>
-        <w:t>crowding_flag</w:t>
-      </w:r>
-      <w:proofErr w:type="spellEnd"/>
-      <w:r>
-        <w:t xml:space="preserve">, </w:t>
-      </w:r>
-      <w:proofErr w:type="spellStart"/>
-      <w:r>
-        <w:t>QoQ_change_signal</w:t>
-      </w:r>
-      <w:proofErr w:type="spellEnd"/>
-      <w:r>
-        <w:t>,</w:t>
-      </w:r>
-    </w:p>
-    <w:p>
-      <w:r>
-        <w:t xml:space="preserve">           </w:t>
-      </w:r>
-      <w:proofErr w:type="spellStart"/>
-      <w:r>
-        <w:t>run_date</w:t>
-      </w:r>
-      <w:proofErr w:type="spellEnd"/>
-    </w:p>
-    <w:p>
-      <w:r>
-        <w:t xml:space="preserve">    FROM </w:t>
-      </w:r>
-      <w:proofErr w:type="spellStart"/>
-      <w:r>
-        <w:t>twos_scores</w:t>
-      </w:r>
-      <w:proofErr w:type="spellEnd"/>
-    </w:p>
-    <w:p>
-      <w:r>
-        <w:t xml:space="preserve">    WHERE </w:t>
-      </w:r>
-      <w:proofErr w:type="spellStart"/>
-      <w:r>
-        <w:t>run_date</w:t>
-      </w:r>
-      <w:proofErr w:type="spellEnd"/>
-      <w:r>
-        <w:t xml:space="preserve"> = (SELECT MAX(</w:t>
-      </w:r>
-      <w:proofErr w:type="spellStart"/>
-      <w:r>
-        <w:t>run_date</w:t>
-      </w:r>
-      <w:proofErr w:type="spellEnd"/>
-      <w:r>
-        <w:t xml:space="preserve">) FROM </w:t>
-      </w:r>
-      <w:proofErr w:type="spellStart"/>
-      <w:r>
-        <w:t>twos_scores</w:t>
-      </w:r>
-      <w:proofErr w:type="spellEnd"/>
-      <w:r>
-        <w:t>)</w:t>
-      </w:r>
-    </w:p>
-    <w:p>
-      <w:r>
-        <w:t xml:space="preserve">    ORDER BY </w:t>
-      </w:r>
-      <w:proofErr w:type="spellStart"/>
-      <w:r>
-        <w:t>twos_score</w:t>
-      </w:r>
-      <w:proofErr w:type="spellEnd"/>
-      <w:r>
-        <w:t xml:space="preserve"> DESC</w:t>
-      </w:r>
-    </w:p>
-    <w:p>
-      <w:r>
-        <w:t xml:space="preserve">    LIMIT 30</w:t>
-      </w:r>
-    </w:p>
-    <w:p>
-      <w:r>
-        <w:t>''').</w:t>
-      </w:r>
-      <w:proofErr w:type="spellStart"/>
-      <w:r>
-        <w:t>fetchall</w:t>
-      </w:r>
-      <w:proofErr w:type="spellEnd"/>
-      <w:r>
-        <w:t>()</w:t>
-      </w:r>
-    </w:p>
-    <w:p>
-      <w:r>
-        <w:t>for r in rows:</w:t>
-      </w:r>
-    </w:p>
-    <w:p>
-      <w:r>
-        <w:t xml:space="preserve">    flag = 'CROWDED' if r['</w:t>
-      </w:r>
-      <w:proofErr w:type="spellStart"/>
-      <w:r>
-        <w:t>crowding_flag</w:t>
-      </w:r>
-      <w:proofErr w:type="spellEnd"/>
-      <w:r>
-        <w:t>'] else ''</w:t>
-      </w:r>
-    </w:p>
-    <w:p>
-      <w:r>
-        <w:t xml:space="preserve">    print(f'{r[\"ticker\"]:8} TWOS:{r[\"</w:t>
-      </w:r>
-      <w:proofErr w:type="spellStart"/>
-      <w:r>
-        <w:t>twos_score</w:t>
-      </w:r>
-      <w:proofErr w:type="spellEnd"/>
-      <w:r>
-        <w:t>\"]:6.3f}  '</w:t>
-      </w:r>
-    </w:p>
-    <w:p>
-      <w:r>
-        <w:t xml:space="preserve">          </w:t>
-      </w:r>
-      <w:proofErr w:type="spellStart"/>
-      <w:r>
-        <w:t>f'tier</w:t>
-      </w:r>
-      <w:proofErr w:type="spellEnd"/>
-      <w:r>
-        <w:t>:{r[\"</w:t>
-      </w:r>
-      <w:proofErr w:type="spellStart"/>
-      <w:r>
-        <w:t>processing_tier</w:t>
-      </w:r>
-      <w:proofErr w:type="spellEnd"/>
-      <w:r>
-        <w:t>\"]:8}  '</w:t>
-      </w:r>
-    </w:p>
-    <w:p>
-      <w:r>
-        <w:t xml:space="preserve">          </w:t>
-      </w:r>
-      <w:proofErr w:type="spellStart"/>
-      <w:r>
-        <w:t>f'institutions</w:t>
-      </w:r>
-      <w:proofErr w:type="spellEnd"/>
-      <w:r>
-        <w:t>:{r[\"</w:t>
-      </w:r>
-      <w:proofErr w:type="spellStart"/>
-      <w:r>
-        <w:t>institution_count</w:t>
-      </w:r>
-      <w:proofErr w:type="spellEnd"/>
-      <w:r>
-        <w:t>\"]:2}  '</w:t>
-      </w:r>
-    </w:p>
-    <w:p>
-      <w:r>
-        <w:t xml:space="preserve">          f'{r[\"</w:t>
-      </w:r>
-      <w:proofErr w:type="spellStart"/>
-      <w:r>
-        <w:t>QoQ_change_signal</w:t>
-      </w:r>
-      <w:proofErr w:type="spellEnd"/>
-      <w:r>
-        <w:t>\"]:25} {flag}')</w:t>
+        <w:t>ticker = 'RVMD'  # change this to any ticker</w:t>
       </w:r>
     </w:p>
     <w:p/>
     <w:p>
-      <w:proofErr w:type="spellStart"/>
-      <w:r>
-        <w:t>conn.close</w:t>
-      </w:r>
-      <w:proofErr w:type="spellEnd"/>
-      <w:r>
-        <w:t>()</w:t>
-      </w:r>
-    </w:p>
-    <w:p>
-      <w:r>
-        <w:t>"</w:t>
-      </w:r>
-    </w:p>
-    <w:p>
-      <w:r>
-        <w:t>To see which institutions hold a specific ticker and what changed:</w:t>
-      </w:r>
-    </w:p>
-    <w:p>
-      <w:r>
-        <w:t>bash</w:t>
-      </w:r>
-    </w:p>
-    <w:p>
-      <w:r>
-        <w:t>python3 -c "</w:t>
-      </w:r>
-    </w:p>
-    <w:p>
-      <w:r>
-        <w:t>import sqlite3</w:t>
-      </w:r>
-    </w:p>
-    <w:p>
-      <w:r>
-        <w:t>conn = sqlite3.connect('data/</w:t>
-      </w:r>
-      <w:proofErr w:type="spellStart"/>
-      <w:r>
-        <w:t>stock_picker.db</w:t>
-      </w:r>
-      <w:proofErr w:type="spellEnd"/>
-      <w:r>
-        <w:t>')</w:t>
-      </w:r>
-    </w:p>
-    <w:p>
-      <w:proofErr w:type="spellStart"/>
-      <w:r>
-        <w:t>conn.row_factory</w:t>
-      </w:r>
-      <w:proofErr w:type="spellEnd"/>
-      <w:r>
-        <w:t xml:space="preserve"> = sqlite3.Row</w:t>
-      </w:r>
-    </w:p>
-    <w:p/>
-    <w:p>
-      <w:r>
-        <w:t>ticker = 'RVMD'  # change this to any ticker</w:t>
-      </w:r>
-    </w:p>
-    <w:p/>
-    <w:p>
-      <w:r>
-        <w:lastRenderedPageBreak/>
+      <w:r>
         <w:t>print(f'=== Institutional holdings for {ticker} ===')</w:t>
       </w:r>
     </w:p>
@@ -1423,6 +1175,7 @@
     </w:p>
     <w:p>
       <w:r>
+        <w:lastRenderedPageBreak/>
         <w:t xml:space="preserve">          </w:t>
       </w:r>
       <w:proofErr w:type="spellStart"/>
@@ -1538,7 +1291,6 @@
     <w:p/>
     <w:p>
       <w:r>
-        <w:lastRenderedPageBreak/>
         <w:t>print('=== Active monitoring universe ===')</w:t>
       </w:r>
     </w:p>
@@ -1782,6 +1534,7 @@
           <w:b/>
           <w:bCs/>
         </w:rPr>
+        <w:lastRenderedPageBreak/>
         <w:t>One practical note before running Step 1.2</w:t>
       </w:r>
     </w:p>
@@ -1841,7 +1594,6 @@
     </w:p>
     <w:p>
       <w:r>
-        <w:lastRenderedPageBreak/>
         <w:pict w14:anchorId="43055434">
           <v:rect id="_x0000_i1032" style="width:0;height:1.5pt" o:hralign="center" o:hrstd="t" o:hr="t" fillcolor="#a0a0a0" stroked="f"/>
         </w:pict>
@@ -1952,6 +1704,7 @@
     </w:p>
     <w:p>
       <w:r>
+        <w:lastRenderedPageBreak/>
         <w:t># up to and including this date for each institution</w:t>
       </w:r>
     </w:p>
@@ -2090,7 +1843,6 @@
     </w:p>
     <w:p>
       <w:r>
-        <w:lastRenderedPageBreak/>
         <w:pict w14:anchorId="3E7C1E9D">
           <v:rect id="_x0000_i1033" style="width:0;height:1.5pt" o:hralign="center" o:hrstd="t" o:hr="t" fillcolor="#a0a0a0" stroked="f"/>
         </w:pict>
@@ -2265,6 +2017,7 @@
     </w:p>
     <w:p>
       <w:r>
+        <w:lastRenderedPageBreak/>
         <w:t>''').</w:t>
       </w:r>
       <w:proofErr w:type="spellStart"/>
@@ -2372,195 +2125,195 @@
     </w:p>
     <w:p>
       <w:r>
+        <w:t xml:space="preserve">    WHERE ticker IS NOT NULL</w:t>
+      </w:r>
+    </w:p>
+    <w:p>
+      <w:r>
+        <w:t>''').</w:t>
+      </w:r>
+      <w:proofErr w:type="spellStart"/>
+      <w:r>
+        <w:t>fetchone</w:t>
+      </w:r>
+      <w:proofErr w:type="spellEnd"/>
+      <w:r>
+        <w:t>()</w:t>
+      </w:r>
+    </w:p>
+    <w:p>
+      <w:r>
+        <w:t>print(f'\</w:t>
+      </w:r>
+      <w:proofErr w:type="spellStart"/>
+      <w:r>
+        <w:t>nResolved</w:t>
+      </w:r>
+      <w:proofErr w:type="spellEnd"/>
+      <w:r>
+        <w:t xml:space="preserve"> tickers: {tickers[\"resolved\"]}')</w:t>
+      </w:r>
+    </w:p>
+    <w:p>
+      <w:r>
+        <w:t>print(</w:t>
+      </w:r>
+      <w:proofErr w:type="spellStart"/>
+      <w:r>
+        <w:t>f'Total</w:t>
+      </w:r>
+      <w:proofErr w:type="spellEnd"/>
+      <w:r>
+        <w:t xml:space="preserve"> unique CUSIPs: {tickers[\"</w:t>
+      </w:r>
+      <w:proofErr w:type="spellStart"/>
+      <w:r>
+        <w:t>total_cusips</w:t>
+      </w:r>
+      <w:proofErr w:type="spellEnd"/>
+      <w:r>
+        <w:t>\"]}')</w:t>
+      </w:r>
+    </w:p>
+    <w:p/>
+    <w:p>
+      <w:r>
+        <w:t># How many unresolved CUSIPs?</w:t>
+      </w:r>
+    </w:p>
+    <w:p>
+      <w:r>
+        <w:t xml:space="preserve">unresolved = </w:t>
+      </w:r>
+      <w:proofErr w:type="spellStart"/>
+      <w:r>
+        <w:t>conn.execute</w:t>
+      </w:r>
+      <w:proofErr w:type="spellEnd"/>
+      <w:r>
+        <w:t>('''</w:t>
+      </w:r>
+    </w:p>
+    <w:p>
+      <w:r>
+        <w:t xml:space="preserve">    SELECT COUNT(*) as count</w:t>
+      </w:r>
+    </w:p>
+    <w:p>
+      <w:r>
+        <w:t xml:space="preserve">    FROM </w:t>
+      </w:r>
+      <w:proofErr w:type="spellStart"/>
+      <w:r>
+        <w:t>cusip_ticker_map</w:t>
+      </w:r>
+      <w:proofErr w:type="spellEnd"/>
+    </w:p>
+    <w:p>
+      <w:r>
+        <w:t xml:space="preserve">    WHERE ticker IS NULL</w:t>
+      </w:r>
+    </w:p>
+    <w:p>
+      <w:r>
+        <w:t>''').</w:t>
+      </w:r>
+      <w:proofErr w:type="spellStart"/>
+      <w:r>
+        <w:t>fetchone</w:t>
+      </w:r>
+      <w:proofErr w:type="spellEnd"/>
+      <w:r>
+        <w:t>()</w:t>
+      </w:r>
+    </w:p>
+    <w:p>
+      <w:r>
+        <w:t>print(</w:t>
+      </w:r>
+      <w:proofErr w:type="spellStart"/>
+      <w:r>
+        <w:t>f'Unresolved</w:t>
+      </w:r>
+      <w:proofErr w:type="spellEnd"/>
+      <w:r>
+        <w:t xml:space="preserve"> CUSIPs: {unresolved[\"count\"]}')</w:t>
+      </w:r>
+    </w:p>
+    <w:p/>
+    <w:p>
+      <w:r>
+        <w:t># Top 10 TWOS scores</w:t>
+      </w:r>
+    </w:p>
+    <w:p>
+      <w:r>
+        <w:t>print('\</w:t>
+      </w:r>
+      <w:proofErr w:type="spellStart"/>
+      <w:r>
+        <w:t>nTop</w:t>
+      </w:r>
+      <w:proofErr w:type="spellEnd"/>
+      <w:r>
+        <w:t xml:space="preserve"> 10 tickers by TWOS:')</w:t>
+      </w:r>
+    </w:p>
+    <w:p>
+      <w:r>
+        <w:t xml:space="preserve">top = </w:t>
+      </w:r>
+      <w:proofErr w:type="spellStart"/>
+      <w:r>
+        <w:t>conn.execute</w:t>
+      </w:r>
+      <w:proofErr w:type="spellEnd"/>
+      <w:r>
+        <w:t>('''</w:t>
+      </w:r>
+    </w:p>
+    <w:p>
+      <w:r>
+        <w:t xml:space="preserve">    SELECT ticker, </w:t>
+      </w:r>
+      <w:proofErr w:type="spellStart"/>
+      <w:r>
+        <w:t>twos_score</w:t>
+      </w:r>
+      <w:proofErr w:type="spellEnd"/>
+      <w:r>
+        <w:t xml:space="preserve">, </w:t>
+      </w:r>
+      <w:proofErr w:type="spellStart"/>
+      <w:r>
+        <w:t>processing_tier</w:t>
+      </w:r>
+      <w:proofErr w:type="spellEnd"/>
+      <w:r>
+        <w:t>,</w:t>
+      </w:r>
+    </w:p>
+    <w:p>
+      <w:r>
+        <w:t xml:space="preserve">           </w:t>
+      </w:r>
+      <w:proofErr w:type="spellStart"/>
+      <w:r>
+        <w:t>institution_count</w:t>
+      </w:r>
+      <w:proofErr w:type="spellEnd"/>
+      <w:r>
+        <w:t xml:space="preserve">, </w:t>
+      </w:r>
+      <w:proofErr w:type="spellStart"/>
+      <w:r>
+        <w:t>QoQ_change_signal</w:t>
+      </w:r>
+      <w:proofErr w:type="spellEnd"/>
+    </w:p>
+    <w:p>
+      <w:r>
         <w:lastRenderedPageBreak/>
-        <w:t xml:space="preserve">    WHERE ticker IS NOT NULL</w:t>
-      </w:r>
-    </w:p>
-    <w:p>
-      <w:r>
-        <w:t>''').</w:t>
-      </w:r>
-      <w:proofErr w:type="spellStart"/>
-      <w:r>
-        <w:t>fetchone</w:t>
-      </w:r>
-      <w:proofErr w:type="spellEnd"/>
-      <w:r>
-        <w:t>()</w:t>
-      </w:r>
-    </w:p>
-    <w:p>
-      <w:r>
-        <w:t>print(f'\</w:t>
-      </w:r>
-      <w:proofErr w:type="spellStart"/>
-      <w:r>
-        <w:t>nResolved</w:t>
-      </w:r>
-      <w:proofErr w:type="spellEnd"/>
-      <w:r>
-        <w:t xml:space="preserve"> tickers: {tickers[\"resolved\"]}')</w:t>
-      </w:r>
-    </w:p>
-    <w:p>
-      <w:r>
-        <w:t>print(</w:t>
-      </w:r>
-      <w:proofErr w:type="spellStart"/>
-      <w:r>
-        <w:t>f'Total</w:t>
-      </w:r>
-      <w:proofErr w:type="spellEnd"/>
-      <w:r>
-        <w:t xml:space="preserve"> unique CUSIPs: {tickers[\"</w:t>
-      </w:r>
-      <w:proofErr w:type="spellStart"/>
-      <w:r>
-        <w:t>total_cusips</w:t>
-      </w:r>
-      <w:proofErr w:type="spellEnd"/>
-      <w:r>
-        <w:t>\"]}')</w:t>
-      </w:r>
-    </w:p>
-    <w:p/>
-    <w:p>
-      <w:r>
-        <w:t># How many unresolved CUSIPs?</w:t>
-      </w:r>
-    </w:p>
-    <w:p>
-      <w:r>
-        <w:t xml:space="preserve">unresolved = </w:t>
-      </w:r>
-      <w:proofErr w:type="spellStart"/>
-      <w:r>
-        <w:t>conn.execute</w:t>
-      </w:r>
-      <w:proofErr w:type="spellEnd"/>
-      <w:r>
-        <w:t>('''</w:t>
-      </w:r>
-    </w:p>
-    <w:p>
-      <w:r>
-        <w:t xml:space="preserve">    SELECT COUNT(*) as count</w:t>
-      </w:r>
-    </w:p>
-    <w:p>
-      <w:r>
-        <w:t xml:space="preserve">    FROM </w:t>
-      </w:r>
-      <w:proofErr w:type="spellStart"/>
-      <w:r>
-        <w:t>cusip_ticker_map</w:t>
-      </w:r>
-      <w:proofErr w:type="spellEnd"/>
-    </w:p>
-    <w:p>
-      <w:r>
-        <w:t xml:space="preserve">    WHERE ticker IS NULL</w:t>
-      </w:r>
-    </w:p>
-    <w:p>
-      <w:r>
-        <w:t>''').</w:t>
-      </w:r>
-      <w:proofErr w:type="spellStart"/>
-      <w:r>
-        <w:t>fetchone</w:t>
-      </w:r>
-      <w:proofErr w:type="spellEnd"/>
-      <w:r>
-        <w:t>()</w:t>
-      </w:r>
-    </w:p>
-    <w:p>
-      <w:r>
-        <w:t>print(</w:t>
-      </w:r>
-      <w:proofErr w:type="spellStart"/>
-      <w:r>
-        <w:t>f'Unresolved</w:t>
-      </w:r>
-      <w:proofErr w:type="spellEnd"/>
-      <w:r>
-        <w:t xml:space="preserve"> CUSIPs: {unresolved[\"count\"]}')</w:t>
-      </w:r>
-    </w:p>
-    <w:p/>
-    <w:p>
-      <w:r>
-        <w:t># Top 10 TWOS scores</w:t>
-      </w:r>
-    </w:p>
-    <w:p>
-      <w:r>
-        <w:t>print('\</w:t>
-      </w:r>
-      <w:proofErr w:type="spellStart"/>
-      <w:r>
-        <w:t>nTop</w:t>
-      </w:r>
-      <w:proofErr w:type="spellEnd"/>
-      <w:r>
-        <w:t xml:space="preserve"> 10 tickers by TWOS:')</w:t>
-      </w:r>
-    </w:p>
-    <w:p>
-      <w:r>
-        <w:t xml:space="preserve">top = </w:t>
-      </w:r>
-      <w:proofErr w:type="spellStart"/>
-      <w:r>
-        <w:t>conn.execute</w:t>
-      </w:r>
-      <w:proofErr w:type="spellEnd"/>
-      <w:r>
-        <w:t>('''</w:t>
-      </w:r>
-    </w:p>
-    <w:p>
-      <w:r>
-        <w:t xml:space="preserve">    SELECT ticker, </w:t>
-      </w:r>
-      <w:proofErr w:type="spellStart"/>
-      <w:r>
-        <w:t>twos_score</w:t>
-      </w:r>
-      <w:proofErr w:type="spellEnd"/>
-      <w:r>
-        <w:t xml:space="preserve">, </w:t>
-      </w:r>
-      <w:proofErr w:type="spellStart"/>
-      <w:r>
-        <w:t>processing_tier</w:t>
-      </w:r>
-      <w:proofErr w:type="spellEnd"/>
-      <w:r>
-        <w:t>,</w:t>
-      </w:r>
-    </w:p>
-    <w:p>
-      <w:r>
-        <w:t xml:space="preserve">           </w:t>
-      </w:r>
-      <w:proofErr w:type="spellStart"/>
-      <w:r>
-        <w:t>institution_count</w:t>
-      </w:r>
-      <w:proofErr w:type="spellEnd"/>
-      <w:r>
-        <w:t xml:space="preserve">, </w:t>
-      </w:r>
-      <w:proofErr w:type="spellStart"/>
-      <w:r>
-        <w:t>QoQ_change_signal</w:t>
-      </w:r>
-      <w:proofErr w:type="spellEnd"/>
-    </w:p>
-    <w:p>
-      <w:r>
         <w:t xml:space="preserve">    FROM </w:t>
       </w:r>
       <w:proofErr w:type="spellStart"/>
@@ -2729,7 +2482,6 @@
     </w:p>
     <w:p>
       <w:r>
-        <w:lastRenderedPageBreak/>
         <w:t>"</w:t>
       </w:r>
     </w:p>
@@ -2962,7 +2714,6 @@
     </w:p>
     <w:p>
       <w:r>
-        <w:lastRenderedPageBreak/>
         <w:t xml:space="preserve">    conn=conn,</w:t>
       </w:r>
     </w:p>
@@ -3101,6 +2852,7 @@
     </w:p>
     <w:p>
       <w:r>
+        <w:lastRenderedPageBreak/>
         <w:t>The cache means you never re-resolve the same CUSIP. So the resolution happens gradually:</w:t>
       </w:r>
     </w:p>
@@ -3206,7 +2958,6 @@
     </w:p>
     <w:p>
       <w:r>
-        <w:lastRenderedPageBreak/>
         <w:t xml:space="preserve">    'Content-Type': 'application/</w:t>
       </w:r>
       <w:proofErr w:type="spellStart"/>
@@ -3350,6 +3101,7 @@
     </w:p>
     <w:p>
       <w:r>
+        <w:lastRenderedPageBreak/>
         <w:t xml:space="preserve">             simulation, complete CUSIP cache</w:t>
       </w:r>
     </w:p>
@@ -3419,7 +3171,6 @@
     </w:p>
     <w:p>
       <w:r>
-        <w:lastRenderedPageBreak/>
         <w:t>Each institution holds on average 50-200 positions per quarter. Many positions overlap across institutions and across quarters — Baker Bros. holding RVMD for 3 years means the same CUSIP appears in 12 quarterly filings but is only resolved once and cached once.</w:t>
       </w:r>
     </w:p>
@@ -3545,6 +3296,7 @@
     </w:p>
     <w:p>
       <w:r>
+        <w:lastRenderedPageBreak/>
         <w:t>× 100 holdings per filing (average)</w:t>
       </w:r>
     </w:p>
@@ -3640,7 +3392,6 @@
     </w:p>
     <w:p>
       <w:r>
-        <w:lastRenderedPageBreak/>
         <w:pict w14:anchorId="5A87078C">
           <v:rect id="_x0000_i1039" style="width:0;height:1.5pt" o:hralign="center" o:hrstd="t" o:hr="t" fillcolor="#a0a0a0" stroked="f"/>
         </w:pict>
@@ -4066,6 +3817,7 @@
           <w:b/>
           <w:bCs/>
         </w:rPr>
+        <w:lastRenderedPageBreak/>
         <w:t>What actually takes time is not storage — it is network calls</w:t>
       </w:r>
     </w:p>
@@ -5338,7 +5090,6 @@
   <w:style w:type="character" w:default="1" w:styleId="DefaultParagraphFont">
     <w:name w:val="Default Paragraph Font"/>
     <w:uiPriority w:val="1"/>
-    <w:semiHidden/>
     <w:unhideWhenUsed/>
   </w:style>
   <w:style w:type="table" w:default="1" w:styleId="TableNormal">
@@ -5652,6 +5403,19 @@
       <w:spacing w:val="5"/>
     </w:rPr>
   </w:style>
+  <w:style w:type="paragraph" w:styleId="NormalWeb">
+    <w:name w:val="Normal (Web)"/>
+    <w:basedOn w:val="Normal"/>
+    <w:uiPriority w:val="99"/>
+    <w:semiHidden/>
+    <w:unhideWhenUsed/>
+    <w:rsid w:val="00A336E3"/>
+    <w:rPr>
+      <w:rFonts w:ascii="Times New Roman" w:hAnsi="Times New Roman" w:cs="Times New Roman"/>
+      <w:sz w:val="24"/>
+      <w:szCs w:val="24"/>
+    </w:rPr>
+  </w:style>
 </w:styles>
 </file>
 

</xml_diff>